<commit_message>
added new changes in jenkins pipeline
</commit_message>
<xml_diff>
--- a/three-tire deployment guide.docx
+++ b/three-tire deployment guide.docx
@@ -940,7 +940,13 @@
       </w:r>
       <w:proofErr w:type="spellEnd"/>
       <w:r>
-        <w:t xml:space="preserve"> --cluster my-cluster --name app-profile --region us-east-1</w:t>
+        <w:t xml:space="preserve"> --cluster my-cluster --name </w:t>
+      </w:r>
+      <w:r>
+        <w:t>three-tier</w:t>
+      </w:r>
+      <w:r>
+        <w:t>-profile --region us-east-1</w:t>
       </w:r>
     </w:p>
     <w:p>
@@ -977,7 +983,16 @@
       </w:r>
       <w:proofErr w:type="spellEnd"/>
       <w:r>
-        <w:t>-profile-name app-profile --region us-east-1</w:t>
+        <w:t xml:space="preserve">-profile-name </w:t>
+      </w:r>
+      <w:r>
+        <w:t>three-tier</w:t>
+      </w:r>
+      <w:r>
+        <w:t>-profile</w:t>
+      </w:r>
+      <w:r>
+        <w:t xml:space="preserve"> --region us-east-1</w:t>
       </w:r>
     </w:p>
     <w:p>
@@ -1831,6 +1846,7 @@
   <w:style w:type="character" w:default="1" w:styleId="DefaultParagraphFont">
     <w:name w:val="Default Paragraph Font"/>
     <w:uiPriority w:val="1"/>
+    <w:semiHidden/>
     <w:unhideWhenUsed/>
   </w:style>
   <w:style w:type="table" w:default="1" w:styleId="TableNormal">

</xml_diff>